<commit_message>
Los decks de clase no nombran el proyecto: ejemplos genericos, tambien en el codigo proyectado
Co-Authored-By: Claude Opus 5.5 <noreply@anthropic.com>
</commit_message>
<xml_diff>
--- a/Bases de Datos II/Kit docente/Clase 1/Guion Docente Clase 1 - Revision BD I y arranque VetCare.docx
+++ b/Bases de Datos II/Kit docente/Clase 1/Guion Docente Clase 1 - Revision BD I y arranque VetCare.docx
@@ -326,7 +326,696 @@
           <w:color w:val="4A4A49"/>
           <w:sz w:val="22"/>
         </w:rPr>
-        <w:t>[Slide 5] El cliente: la clinica Huellitas (1/2)</w:t>
+        <w:t>El cliente: la clinica Huellitas</w:t>
+      </w:r>
+      <w:r>
+        <w:rPr>
+          <w:b w:val="0"/>
+          <w:color w:val="4A4A49"/>
+          <w:sz w:val="22"/>
+        </w:rPr>
+        <w:t xml:space="preserve"> — 5 vinetas.</w:t>
+      </w:r>
+    </w:p>
+    <w:p>
+      <w:pPr>
+        <w:pStyle w:val="ListBullet2"/>
+      </w:pPr>
+      <w:r>
+        <w:rPr>
+          <w:b w:val="0"/>
+          <w:color w:val="4A4A49"/>
+          <w:sz w:val="22"/>
+        </w:rPr>
+        <w:t>Antes de dibujar una sola tabla hay que decir para quien se dibuja.</w:t>
+      </w:r>
+    </w:p>
+    <w:p>
+      <w:pPr>
+        <w:pStyle w:val="ListBullet2"/>
+      </w:pPr>
+      <w:r>
+        <w:rPr>
+          <w:b w:val="0"/>
+          <w:color w:val="4A4A49"/>
+          <w:sz w:val="22"/>
+        </w:rPr>
+        <w:t>Hay que fijar la nomenclatura en voz alta porque el material la usa con precision y el estudiante la mezcla: la clínica es la CLINICA, es decir el cliente que tiene el problema; la clínica es el SISTEMA que se le construye, y la base de la clínica es concretamente la base de datos de ese sistema, que es lo que se hace en esta asignatura.</w:t>
+      </w:r>
+    </w:p>
+    <w:p>
+      <w:pPr>
+        <w:pStyle w:val="ListBullet2"/>
+      </w:pPr>
+      <w:r>
+        <w:rPr>
+          <w:b w:val="0"/>
+          <w:color w:val="4A4A49"/>
+          <w:sz w:val="22"/>
+        </w:rPr>
+        <w:t>Programacion II construye la aplicacion para el mismo cliente y Seminario disena sus planos, asi que un estudiante que curse dos de las tres materias trabaja el mismo caso desde dos angulos.</w:t>
+      </w:r>
+    </w:p>
+    <w:p>
+      <w:pPr>
+        <w:pStyle w:val="ListBullet2"/>
+      </w:pPr>
+      <w:r>
+        <w:rPr>
+          <w:b w:val="0"/>
+          <w:color w:val="4A4A49"/>
+          <w:sz w:val="22"/>
+        </w:rPr>
+        <w:t>Los tres interesados son la herramienta de decision mas util que se le puede dar hoy al estudiante, y estan en la diapositiva por eso.</w:t>
+      </w:r>
+    </w:p>
+    <w:p>
+      <w:pPr>
+        <w:pStyle w:val="ListBullet2"/>
+      </w:pPr>
+      <w:r>
+        <w:rPr>
+          <w:b w:val="0"/>
+          <w:color w:val="4A4A49"/>
+          <w:sz w:val="22"/>
+        </w:rPr>
+        <w:t>El dueno de la clinica quiere metricas del negocio.</w:t>
+      </w:r>
+    </w:p>
+    <w:p>
+      <w:pPr>
+        <w:pStyle w:val="ListBullet2"/>
+      </w:pPr>
+      <w:r>
+        <w:rPr>
+          <w:b w:val="0"/>
+          <w:color w:val="4A4A49"/>
+          <w:sz w:val="22"/>
+        </w:rPr>
+        <w:t>La recepcionista quiere agendar rapido y con pocos clics.</w:t>
+      </w:r>
+    </w:p>
+    <w:p>
+      <w:pPr>
+        <w:pStyle w:val="ListBullet2"/>
+      </w:pPr>
+      <w:r>
+        <w:rPr>
+          <w:b w:val="0"/>
+          <w:color w:val="4A4A49"/>
+          <w:sz w:val="22"/>
+        </w:rPr>
+        <w:t>El veterinario quiere el historial del paciente a la mano durante la consulta.</w:t>
+      </w:r>
+    </w:p>
+    <w:p>
+      <w:pPr>
+        <w:pStyle w:val="ListBullet2"/>
+      </w:pPr>
+      <w:r>
+        <w:rPr>
+          <w:b w:val="0"/>
+          <w:color w:val="4A4A49"/>
+          <w:sz w:val="22"/>
+        </w:rPr>
+        <w:t>Lo importante, y hay que subrayarlo, es que esos intereses ENTRAN EN CONFLICTO: pedir mas datos en el formulario de la cita da mejores metricas al dueno y le hace mas lento el trabajo a la recepcionista.</w:t>
+      </w:r>
+    </w:p>
+    <w:p>
+      <w:pPr>
+        <w:pStyle w:val="ListBullet2"/>
+      </w:pPr>
+      <w:r>
+        <w:rPr>
+          <w:b w:val="0"/>
+          <w:color w:val="4A4A49"/>
+          <w:sz w:val="22"/>
+        </w:rPr>
+        <w:t>Ahi esta la diferencia entre un modelo copiado y uno decidido.</w:t>
+      </w:r>
+    </w:p>
+    <w:p>
+      <w:pPr>
+        <w:pStyle w:val="ListBullet2"/>
+      </w:pPr>
+      <w:r>
+        <w:rPr>
+          <w:b w:val="0"/>
+          <w:color w:val="4A4A49"/>
+          <w:sz w:val="22"/>
+        </w:rPr>
+        <w:t>Fuera de la lamina (habla de la practica): Antes de dibujar una sola tabla hay que decir para quien se dibuja, porque el taller de hoy y los enunciados de las quince clases estan escritos sobre un cliente concreto y con nombre. la clínica Veterinaria atiende un alto volumen de pacientes y lleva toda su gestion en carpetas de papel.</w:t>
+      </w:r>
+    </w:p>
+    <w:p>
+      <w:pPr>
+        <w:pStyle w:val="ListBullet2"/>
+      </w:pPr>
+      <w:r>
+        <w:rPr>
+          <w:b w:val="0"/>
+          <w:color w:val="4A4A49"/>
+          <w:sz w:val="22"/>
+        </w:rPr>
+        <w:t>Fuera de la lamina (habla de la practica): La administracion reporta tres problemas y conviene enunciarlos tal cual, porque cada uno se traduce despues en una decision de esquema: se extravian fichas de pacientes, y esa es la razon de que el expediente tenga que vivir en una fila con clave primaria y no en un papel; buscar un historial en el archivo fisico genera filas en la sala de espera, que es el motivo por el que en la Clase 7 se habla de indices y no como un tema abstracto de rendimiento; y no hay metricas, no saben cuantas especies atienden al mes, que es exactamente la consulta agregada que aparece en el taller de la Clase 6.</w:t>
+      </w:r>
+    </w:p>
+    <w:p>
+      <w:pPr>
+        <w:pStyle w:val="ListBullet2"/>
+      </w:pPr>
+      <w:r>
+        <w:rPr>
+          <w:b w:val="0"/>
+          <w:color w:val="4A4A49"/>
+          <w:sz w:val="22"/>
+        </w:rPr>
+        <w:t>Fuera de la lamina (habla de la practica): Un curso de bases de datos que no nombra al cliente convierte cada taller en un ejercicio suelto; nombrarlo hace que el estudiante pueda decidir por si mismo si un dato sobra.</w:t>
+      </w:r>
+    </w:p>
+    <w:p>
+      <w:pPr>
+        <w:pStyle w:val="ListBullet2"/>
+      </w:pPr>
+      <w:r>
+        <w:rPr>
+          <w:b w:val="0"/>
+          <w:color w:val="4A4A49"/>
+          <w:sz w:val="22"/>
+        </w:rPr>
+        <w:t>Fuera de la lamina (habla de la practica): Cuando en un taller un estudiante pregunte si una columna sobra, la respuesta del docente no deberia ser si o no sino otra pregunta: cual de los tres la necesita, y que pierde otro si la agregamos.</w:t>
+      </w:r>
+    </w:p>
+    <w:p>
+      <w:r>
+        <w:rPr>
+          <w:b/>
+          <w:color w:val="4A4A49"/>
+          <w:sz w:val="22"/>
+        </w:rPr>
+        <w:t>Por que esto no es Bases de Datos I, y el vocabulario minimo (1/2)</w:t>
+      </w:r>
+      <w:r>
+        <w:rPr>
+          <w:b w:val="0"/>
+          <w:color w:val="4A4A49"/>
+          <w:sz w:val="22"/>
+        </w:rPr>
+        <w:t xml:space="preserve"> — 4 vinetas.</w:t>
+      </w:r>
+    </w:p>
+    <w:p>
+      <w:pPr>
+        <w:pStyle w:val="ListBullet2"/>
+      </w:pPr>
+      <w:r>
+        <w:rPr>
+          <w:b w:val="0"/>
+          <w:color w:val="4A4A49"/>
+          <w:sz w:val="22"/>
+        </w:rPr>
+        <w:t>Esta clase parece repetir Bases de Datos I y no lo hace.</w:t>
+      </w:r>
+    </w:p>
+    <w:p>
+      <w:pPr>
+        <w:pStyle w:val="ListBullet2"/>
+      </w:pPr>
+      <w:r>
+        <w:rPr>
+          <w:b w:val="0"/>
+          <w:color w:val="4A4A49"/>
+          <w:sz w:val="22"/>
+        </w:rPr>
+        <w:t>Conviene fijar el vocabulario operativo antes de dibujar nada.</w:t>
+      </w:r>
+    </w:p>
+    <w:p>
+      <w:pPr>
+        <w:pStyle w:val="ListBullet2"/>
+      </w:pPr>
+      <w:r>
+        <w:rPr>
+          <w:b w:val="0"/>
+          <w:color w:val="4A4A49"/>
+          <w:sz w:val="22"/>
+        </w:rPr>
+        <w:t>Conviene desactivar una trampa de vocabulario: la palabra dominio se usara hoy con dos sentidos, el de un atributo y el del proyecto, que es la clínica.</w:t>
+      </w:r>
+    </w:p>
+    <w:p>
+      <w:r>
+        <w:rPr>
+          <w:b/>
+          <w:color w:val="4A4A49"/>
+          <w:sz w:val="22"/>
+        </w:rPr>
+        <w:t>Por que esto no es Bases de Datos I, y el vocabulario minimo (2/2)</w:t>
+      </w:r>
+      <w:r>
+        <w:rPr>
+          <w:b w:val="0"/>
+          <w:color w:val="4A4A49"/>
+          <w:sz w:val="22"/>
+        </w:rPr>
+        <w:t xml:space="preserve"> — 2 vinetas.</w:t>
+      </w:r>
+    </w:p>
+    <w:p>
+      <w:r>
+        <w:rPr>
+          <w:b/>
+          <w:color w:val="4A4A49"/>
+          <w:sz w:val="22"/>
+        </w:rPr>
+        <w:t>Nivel conceptual y nivel fisico: dos vistas del mismo modelo</w:t>
+      </w:r>
+      <w:r>
+        <w:rPr>
+          <w:b w:val="0"/>
+          <w:color w:val="4A4A49"/>
+          <w:sz w:val="22"/>
+        </w:rPr>
+        <w:t xml:space="preserve"> — 4 vinetas.</w:t>
+      </w:r>
+    </w:p>
+    <w:p>
+      <w:pPr>
+        <w:pStyle w:val="ListBullet2"/>
+      </w:pPr>
+      <w:r>
+        <w:rPr>
+          <w:b w:val="0"/>
+          <w:color w:val="4A4A49"/>
+          <w:sz w:val="22"/>
+        </w:rPr>
+        <w:t>Antes de cualquier otra cosa hay que separar dos niveles que el estudiante mezcla y que hoy se recorren los dos.</w:t>
+      </w:r>
+    </w:p>
+    <w:p>
+      <w:pPr>
+        <w:pStyle w:val="ListBullet2"/>
+      </w:pPr>
+      <w:r>
+        <w:rPr>
+          <w:b w:val="0"/>
+          <w:color w:val="4A4A49"/>
+          <w:sz w:val="22"/>
+        </w:rPr>
+        <w:t>Conviene decirlo en voz alta porque explica por que se exige tipo y longitud en el diagrama: no es decoracion, es lo que hace traducible el dibujo.</w:t>
+      </w:r>
+    </w:p>
+    <w:p>
+      <w:r>
+        <w:rPr>
+          <w:b/>
+          <w:color w:val="4A4A49"/>
+          <w:sz w:val="22"/>
+        </w:rPr>
+        <w:t>Clave primaria: natural o sustituta</w:t>
+      </w:r>
+      <w:r>
+        <w:rPr>
+          <w:b w:val="0"/>
+          <w:color w:val="4A4A49"/>
+          <w:sz w:val="22"/>
+        </w:rPr>
+        <w:t xml:space="preserve"> — 6 vinetas.</w:t>
+      </w:r>
+    </w:p>
+    <w:p>
+      <w:pPr>
+        <w:pStyle w:val="ListBullet2"/>
+      </w:pPr>
+      <w:r>
+        <w:rPr>
+          <w:b w:val="0"/>
+          <w:color w:val="4A4A49"/>
+          <w:sz w:val="22"/>
+        </w:rPr>
+        <w:t>Eso no es estilo, es una restriccion que el motor verifica en cada INSERT y UPDATE y que rechaza con error.</w:t>
+      </w:r>
+    </w:p>
+    <w:p>
+      <w:pPr>
+        <w:pStyle w:val="ListBullet2"/>
+      </w:pPr>
+      <w:r>
+        <w:rPr>
+          <w:b w:val="0"/>
+          <w:color w:val="4A4A49"/>
+          <w:sz w:val="22"/>
+        </w:rPr>
+        <w:t>La natural ahorra un JOIN cuando se busca por ella; la sustituta gana cuando el dato natural cambia, se repite o todavia no existe.</w:t>
+      </w:r>
+    </w:p>
+    <w:p>
+      <w:pPr>
+        <w:pStyle w:val="ListBullet2"/>
+      </w:pPr>
+      <w:r>
+        <w:rPr>
+          <w:b w:val="0"/>
+          <w:color w:val="4A4A49"/>
+          <w:sz w:val="22"/>
+        </w:rPr>
+        <w:t>Por eso el esquema usa identificadores sustitutos y guarda el dato natural aparte con unicidad:.</w:t>
+      </w:r>
+    </w:p>
+    <w:p>
+      <w:pPr>
+        <w:pStyle w:val="ListBullet2"/>
+      </w:pPr>
+      <w:r>
+        <w:rPr>
+          <w:b w:val="0"/>
+          <w:color w:val="4A4A49"/>
+          <w:sz w:val="22"/>
+        </w:rPr>
+        <w:t>UNIQUE impide dos duenos con la misma cedula, permite dejarla nula un rato y permite corregirla sin tocar las filas de mascota que apuntan al dueno.</w:t>
+      </w:r>
+    </w:p>
+    <w:p>
+      <w:r>
+        <w:rPr>
+          <w:b/>
+          <w:color w:val="4A4A49"/>
+          <w:sz w:val="22"/>
+        </w:rPr>
+        <w:t>Clave primaria: natural o sustituta — sintaxis</w:t>
+      </w:r>
+      <w:r>
+        <w:rPr>
+          <w:b w:val="0"/>
+          <w:color w:val="4A4A49"/>
+          <w:sz w:val="22"/>
+        </w:rPr>
+        <w:t xml:space="preserve"> — 7 vinetas.</w:t>
+      </w:r>
+    </w:p>
+    <w:p>
+      <w:r>
+        <w:rPr>
+          <w:b/>
+          <w:color w:val="4A4A49"/>
+          <w:sz w:val="22"/>
+        </w:rPr>
+        <w:t>Normalizacion 1FN-3FN: primero la enfermedad (1/2)</w:t>
+      </w:r>
+      <w:r>
+        <w:rPr>
+          <w:b w:val="0"/>
+          <w:color w:val="4A4A49"/>
+          <w:sz w:val="22"/>
+        </w:rPr>
+        <w:t xml:space="preserve"> — 6 vinetas.</w:t>
+      </w:r>
+    </w:p>
+    <w:p>
+      <w:pPr>
+        <w:pStyle w:val="ListBullet2"/>
+      </w:pPr>
+      <w:r>
+        <w:rPr>
+          <w:b w:val="0"/>
+          <w:color w:val="4A4A49"/>
+          <w:sz w:val="22"/>
+        </w:rPr>
+        <w:t>Supongamos que el estudiante guarda el telefono del dueno dentro de cada fila de cita.</w:t>
+      </w:r>
+    </w:p>
+    <w:p>
+      <w:pPr>
+        <w:pStyle w:val="ListBullet2"/>
+      </w:pPr>
+      <w:r>
+        <w:rPr>
+          <w:b w:val="0"/>
+          <w:color w:val="4A4A49"/>
+          <w:sz w:val="22"/>
+        </w:rPr>
+        <w:t>Aparecen tres anomalias.</w:t>
+      </w:r>
+    </w:p>
+    <w:p>
+      <w:pPr>
+        <w:pStyle w:val="ListBullet2"/>
+      </w:pPr>
+      <w:r>
+        <w:rPr>
+          <w:b w:val="0"/>
+          <w:color w:val="4A4A49"/>
+          <w:sz w:val="22"/>
+        </w:rPr>
+        <w:t>Leidas asi, las tres formas normales son tres vacunas.</w:t>
+      </w:r>
+    </w:p>
+    <w:p>
+      <w:r>
+        <w:rPr>
+          <w:b/>
+          <w:color w:val="4A4A49"/>
+          <w:sz w:val="22"/>
+        </w:rPr>
+        <w:t>Normalizacion 1FN-3FN: primero la enfermedad (2/2)</w:t>
+      </w:r>
+      <w:r>
+        <w:rPr>
+          <w:b w:val="0"/>
+          <w:color w:val="4A4A49"/>
+          <w:sz w:val="22"/>
+        </w:rPr>
+        <w:t xml:space="preserve"> — 4 vinetas.</w:t>
+      </w:r>
+    </w:p>
+    <w:p>
+      <w:r>
+        <w:rPr>
+          <w:b/>
+          <w:color w:val="4A4A49"/>
+          <w:sz w:val="22"/>
+        </w:rPr>
+        <w:t>Clave foranea, borrado y por que la FK no basta (1/2)</w:t>
+      </w:r>
+      <w:r>
+        <w:rPr>
+          <w:b w:val="0"/>
+          <w:color w:val="4A4A49"/>
+          <w:sz w:val="22"/>
+        </w:rPr>
+        <w:t xml:space="preserve"> — 5 vinetas.</w:t>
+      </w:r>
+    </w:p>
+    <w:p>
+      <w:pPr>
+        <w:pStyle w:val="ListBullet2"/>
+      </w:pPr>
+      <w:r>
+        <w:rPr>
+          <w:b w:val="0"/>
+          <w:color w:val="4A4A49"/>
+          <w:sz w:val="22"/>
+        </w:rPr>
+        <w:t>Lo que casi nunca se explica es la otra mitad: que pasa al borrar el padre.</w:t>
+      </w:r>
+    </w:p>
+    <w:p>
+      <w:pPr>
+        <w:pStyle w:val="ListBullet2"/>
+      </w:pPr>
+      <w:r>
+        <w:rPr>
+          <w:b w:val="0"/>
+          <w:color w:val="4A4A49"/>
+          <w:sz w:val="22"/>
+        </w:rPr>
+        <w:t>Al declarar la clave foranea se elige el comportamiento</w:t>
+      </w:r>
+    </w:p>
+    <w:p>
+      <w:pPr>
+        <w:pStyle w:val="ListBullet2"/>
+      </w:pPr>
+      <w:r>
+        <w:rPr>
+          <w:b w:val="0"/>
+          <w:color w:val="4A4A49"/>
+          <w:sz w:val="22"/>
+        </w:rPr>
+        <w:t>RESTRICT o NO ACTION impide borrar el dueno mientras tenga mascotas, CASCADE borra las filas hijas en cadena y SET NULL deja la referencia nula.</w:t>
+      </w:r>
+    </w:p>
+    <w:p>
+      <w:pPr>
+        <w:pStyle w:val="ListBullet2"/>
+      </w:pPr>
+      <w:r>
+        <w:rPr>
+          <w:b w:val="0"/>
+          <w:color w:val="4A4A49"/>
+          <w:sz w:val="22"/>
+        </w:rPr>
+        <w:t>Esa baja logica es la que obliga a validar en la Clase 3 que una mascota inactiva no agende, porque la clave foranea la sigue aceptando: el identificador existe, el negocio no lo quiere.</w:t>
+      </w:r>
+    </w:p>
+    <w:p>
+      <w:pPr>
+        <w:pStyle w:val="ListBullet2"/>
+      </w:pPr>
+      <w:r>
+        <w:rPr>
+          <w:b w:val="0"/>
+          <w:color w:val="4A4A49"/>
+          <w:sz w:val="22"/>
+        </w:rPr>
+        <w:t>ON DELETE SET NULL deja la fila huerfana con la columna en nulo.</w:t>
+      </w:r>
+    </w:p>
+    <w:p>
+      <w:r>
+        <w:rPr>
+          <w:b/>
+          <w:color w:val="4A4A49"/>
+          <w:sz w:val="22"/>
+        </w:rPr>
+        <w:t>Clave foranea, borrado y por que la FK no basta (2/2)</w:t>
+      </w:r>
+      <w:r>
+        <w:rPr>
+          <w:b w:val="0"/>
+          <w:color w:val="4A4A49"/>
+          <w:sz w:val="22"/>
+        </w:rPr>
+        <w:t xml:space="preserve"> — 4 vinetas.</w:t>
+      </w:r>
+    </w:p>
+    <w:p>
+      <w:r>
+        <w:rPr>
+          <w:b/>
+          <w:color w:val="4A4A49"/>
+          <w:sz w:val="22"/>
+        </w:rPr>
+        <w:t>Clave foranea, borrado y por que la FK no... — sintaxis</w:t>
+      </w:r>
+      <w:r>
+        <w:rPr>
+          <w:b w:val="0"/>
+          <w:color w:val="4A4A49"/>
+          <w:sz w:val="22"/>
+        </w:rPr>
+        <w:t xml:space="preserve"> — 2 vinetas.</w:t>
+      </w:r>
+    </w:p>
+    <w:p>
+      <w:r>
+        <w:rPr>
+          <w:b/>
+          <w:color w:val="4A4A49"/>
+          <w:sz w:val="22"/>
+        </w:rPr>
+        <w:t>Baja logica: activa CHAR(1) en vez de DELETE</w:t>
+      </w:r>
+      <w:r>
+        <w:rPr>
+          <w:b w:val="0"/>
+          <w:color w:val="4A4A49"/>
+          <w:sz w:val="22"/>
+        </w:rPr>
+        <w:t xml:space="preserve"> — 4 vinetas.</w:t>
+      </w:r>
+    </w:p>
+    <w:p>
+      <w:pPr>
+        <w:pStyle w:val="ListBullet2"/>
+      </w:pPr>
+      <w:r>
+        <w:rPr>
+          <w:b w:val="0"/>
+          <w:color w:val="4A4A49"/>
+          <w:sz w:val="22"/>
+        </w:rPr>
+        <w:t>Conviene detenerse en la baja logica porque es la decision que sostiene medio semestre y casi nunca se explica.</w:t>
+      </w:r>
+    </w:p>
+    <w:p>
+      <w:pPr>
+        <w:pStyle w:val="ListBullet2"/>
+      </w:pPr>
+      <w:r>
+        <w:rPr>
+          <w:b w:val="0"/>
+          <w:color w:val="4A4A49"/>
+          <w:sz w:val="22"/>
+        </w:rPr>
+        <w:t>Lo que se hace es marcar la fila como inactiva: activa CHAR(1) DEFAULT 'S' CHECK (activa IN ('S','N')), y las consultas del dia a dia filtran WHERE activa = 'S'.</w:t>
+      </w:r>
+    </w:p>
+    <w:p>
+      <w:pPr>
+        <w:pStyle w:val="ListBullet2"/>
+      </w:pPr>
+      <w:r>
+        <w:rPr>
+          <w:b w:val="0"/>
+          <w:color w:val="4A4A49"/>
+          <w:sz w:val="22"/>
+        </w:rPr>
+        <w:t>La consecuencia que hay que subrayar, porque es la que abre la Clase 3, es que la clave foranea NO defiende esa regla: para el motor, la mascota inactiva existe y su identificador es valido, asi que aceptara sin chistar una cita nueva sobre ella.</w:t>
+      </w:r>
+    </w:p>
+    <w:p>
+      <w:pPr>
+        <w:pStyle w:val="ListBullet2"/>
+      </w:pPr>
+      <w:r>
+        <w:rPr>
+          <w:b w:val="0"/>
+          <w:color w:val="4A4A49"/>
+          <w:sz w:val="22"/>
+        </w:rPr>
+        <w:t>Si el estudiante sale hoy con DELETE en la cabeza, en la Clase 3 no va a entender por que hace falta sp_agendar_cita.</w:t>
+      </w:r>
+    </w:p>
+    <w:p>
+      <w:r>
+        <w:rPr>
+          <w:b/>
+          <w:color w:val="4A4A49"/>
+          <w:sz w:val="22"/>
+        </w:rPr>
+        <w:t>Que separa un diagrama ER de un dibujo (1/2)</w:t>
+      </w:r>
+      <w:r>
+        <w:rPr>
+          <w:b w:val="0"/>
+          <w:color w:val="4A4A49"/>
+          <w:sz w:val="22"/>
+        </w:rPr>
+        <w:t xml:space="preserve"> — 5 vinetas.</w:t>
+      </w:r>
+    </w:p>
+    <w:p>
+      <w:pPr>
+        <w:pStyle w:val="ListBullet2"/>
+      </w:pPr>
+      <w:r>
+        <w:rPr>
+          <w:b w:val="0"/>
+          <w:color w:val="4A4A49"/>
+          <w:sz w:val="22"/>
+        </w:rPr>
+        <w:t>Eso se materializa como consulta.id_cita NOT NULL UNIQUE, no como una clave foranea simple, y decidirlo hoy evita la pregunta que aparece en la Clase 3 cuando alguien intenta registrar la consulta antes de la cita.</w:t>
+      </w:r>
+    </w:p>
+    <w:p>
+      <w:r>
+        <w:rPr>
+          <w:b/>
+          <w:color w:val="4A4A49"/>
+          <w:sz w:val="22"/>
+        </w:rPr>
+        <w:t>Que separa un diagrama ER de un dibujo (2/2)</w:t>
       </w:r>
       <w:r>
         <w:rPr>
@@ -338,185 +1027,21 @@
       </w:r>
     </w:p>
     <w:p>
-      <w:pPr>
-        <w:pStyle w:val="ListBullet2"/>
-      </w:pPr>
+      <w:r>
+        <w:rPr>
+          <w:b/>
+          <w:color w:val="4A4A49"/>
+          <w:sz w:val="22"/>
+        </w:rPr>
+        <w:t>Tipos de datos: donde se pagan las facturas mas caras (1/2)</w:t>
+      </w:r>
       <w:r>
         <w:rPr>
           <w:b w:val="0"/>
           <w:color w:val="4A4A49"/>
           <w:sz w:val="22"/>
         </w:rPr>
-        <w:t>Antes de dibujar una sola tabla hay que decir para quien se dibuja.</w:t>
-      </w:r>
-    </w:p>
-    <w:p>
-      <w:pPr>
-        <w:pStyle w:val="ListBullet2"/>
-      </w:pPr>
-      <w:r>
-        <w:rPr>
-          <w:b w:val="0"/>
-          <w:color w:val="4A4A49"/>
-          <w:sz w:val="22"/>
-        </w:rPr>
-        <w:t>La Clinica Veterinaria Huellitas atiende un alto volumen de pacientes y lleva toda su gestion en carpetas de papel.</w:t>
-      </w:r>
-    </w:p>
-    <w:p>
-      <w:pPr>
-        <w:pStyle w:val="ListBullet2"/>
-      </w:pPr>
-      <w:r>
-        <w:rPr>
-          <w:b w:val="0"/>
-          <w:color w:val="4A4A49"/>
-          <w:sz w:val="22"/>
-        </w:rPr>
-        <w:t>Hay que fijar la nomenclatura en voz alta porque el material la usa con precision y el estudiante la mezcla: Huellitas es la CLINICA, es decir el cliente que tiene el problema</w:t>
-      </w:r>
-    </w:p>
-    <w:p>
-      <w:pPr>
-        <w:pStyle w:val="ListBullet2"/>
-      </w:pPr>
-      <w:r>
-        <w:rPr>
-          <w:b w:val="0"/>
-          <w:color w:val="4A4A49"/>
-          <w:sz w:val="22"/>
-        </w:rPr>
-        <w:t>Programacion II construye la aplicacion para el mismo cliente y Seminario disena sus planos, asi que un estudiante que curse dos de las tres materias trabaja el mismo caso desde dos angulos.</w:t>
-      </w:r>
-    </w:p>
-    <w:p>
-      <w:pPr>
-        <w:pStyle w:val="ListBullet2"/>
-      </w:pPr>
-      <w:r>
-        <w:rPr>
-          <w:b w:val="0"/>
-          <w:color w:val="4A4A49"/>
-          <w:sz w:val="22"/>
-        </w:rPr>
-        <w:t>Los tres interesados son la herramienta de decision mas util que se le puede dar hoy al estudiante, y estan en la diapositiva por eso.</w:t>
-      </w:r>
-    </w:p>
-    <w:p>
-      <w:pPr>
-        <w:pStyle w:val="ListBullet2"/>
-      </w:pPr>
-      <w:r>
-        <w:rPr>
-          <w:b w:val="0"/>
-          <w:color w:val="4A4A49"/>
-          <w:sz w:val="22"/>
-        </w:rPr>
-        <w:t>El dueno de la clinica quiere metricas del negocio.</w:t>
-      </w:r>
-    </w:p>
-    <w:p>
-      <w:pPr>
-        <w:pStyle w:val="ListBullet2"/>
-      </w:pPr>
-      <w:r>
-        <w:rPr>
-          <w:b w:val="0"/>
-          <w:color w:val="4A4A49"/>
-          <w:sz w:val="22"/>
-        </w:rPr>
-        <w:t>La recepcionista quiere agendar rapido y con pocos clics.</w:t>
-      </w:r>
-    </w:p>
-    <w:p>
-      <w:pPr>
-        <w:pStyle w:val="ListBullet2"/>
-      </w:pPr>
-      <w:r>
-        <w:rPr>
-          <w:b w:val="0"/>
-          <w:color w:val="4A4A49"/>
-          <w:sz w:val="22"/>
-        </w:rPr>
-        <w:t>El veterinario quiere el historial del paciente a la mano durante la consulta.</w:t>
-      </w:r>
-    </w:p>
-    <w:p>
-      <w:pPr>
-        <w:pStyle w:val="ListBullet2"/>
-      </w:pPr>
-      <w:r>
-        <w:rPr>
-          <w:b w:val="0"/>
-          <w:color w:val="4A4A49"/>
-          <w:sz w:val="22"/>
-        </w:rPr>
-        <w:t>Lo importante, y hay que subrayarlo, es que esos intereses ENTRAN EN CONFLICTO: pedir mas datos en el formulario de la cita da mejores metricas al dueno y le hace mas lento el trabajo a la recepcionista.</w:t>
-      </w:r>
-    </w:p>
-    <w:p>
-      <w:pPr>
-        <w:pStyle w:val="ListBullet2"/>
-      </w:pPr>
-      <w:r>
-        <w:rPr>
-          <w:b w:val="0"/>
-          <w:color w:val="4A4A49"/>
-          <w:sz w:val="22"/>
-        </w:rPr>
-        <w:t>Ahi esta la diferencia entre un modelo copiado y uno decidido.</w:t>
-      </w:r>
-    </w:p>
-    <w:p>
-      <w:pPr>
-        <w:pStyle w:val="ListBullet2"/>
-      </w:pPr>
-      <w:r>
-        <w:rPr>
-          <w:b w:val="0"/>
-          <w:color w:val="4A4A49"/>
-          <w:sz w:val="22"/>
-        </w:rPr>
-        <w:t>Fuera de la lamina (habla de la practica): Antes de dibujar una sola tabla hay que decir para quien se dibuja, porque el taller de hoy y los enunciados de las quince clases estan escritos sobre un cliente concreto y con nombre.</w:t>
-      </w:r>
-    </w:p>
-    <w:p>
-      <w:pPr>
-        <w:pStyle w:val="ListBullet2"/>
-      </w:pPr>
-      <w:r>
-        <w:rPr>
-          <w:b w:val="0"/>
-          <w:color w:val="4A4A49"/>
-          <w:sz w:val="22"/>
-        </w:rPr>
-        <w:t>Fuera de la lamina (habla de la practica): La administracion reporta tres problemas y conviene enunciarlos tal cual, porque cada uno se traduce despues en una decision de esquema: se extravian fichas de pacientes, y esa es la razon de que el expediente tenga que vivir en una fila con clave primaria y no en un papel; buscar un historial en el archivo fisico genera filas en la sala de espera, que es el motivo por el que en la Clase 7 se habla de indices y no como un tema abstracto de rendimiento; y no hay metricas, no saben cuantas especies atienden al mes, que es exactamente la consulta agregada que aparece en el taller de la Clase 6.</w:t>
-      </w:r>
-    </w:p>
-    <w:p>
-      <w:pPr>
-        <w:pStyle w:val="ListBullet2"/>
-      </w:pPr>
-      <w:r>
-        <w:rPr>
-          <w:b w:val="0"/>
-          <w:color w:val="4A4A49"/>
-          <w:sz w:val="22"/>
-        </w:rPr>
-        <w:t>Fuera de la lamina (habla de la practica): Un curso de bases de datos que no nombra al cliente convierte cada taller en un ejercicio suelto; nombrarlo hace que el estudiante pueda decidir por si mismo si un dato sobra.</w:t>
-      </w:r>
-    </w:p>
-    <w:p>
-      <w:pPr>
-        <w:pStyle w:val="ListBullet2"/>
-      </w:pPr>
-      <w:r>
-        <w:rPr>
-          <w:b w:val="0"/>
-          <w:color w:val="4A4A49"/>
-          <w:sz w:val="22"/>
-        </w:rPr>
-        <w:t>Fuera de la lamina (habla de la practica): Cuando en un taller un estudiante pregunte si una columna sobra, la respuesta del docente no deberia ser si o no sino otra pregunta: cual de los tres la necesita, y que pierde otro si la agregamos.</w:t>
+        <w:t xml:space="preserve"> — 4 vinetas.</w:t>
       </w:r>
     </w:p>
     <w:p>
@@ -526,7 +1051,7 @@
           <w:color w:val="4A4A49"/>
           <w:sz w:val="22"/>
         </w:rPr>
-        <w:t>[Slide 6] El cliente: la clinica Huellitas (2/2)</w:t>
+        <w:t>Tipos de datos: donde se pagan las facturas mas caras (2/2)</w:t>
       </w:r>
       <w:r>
         <w:rPr>
@@ -544,7 +1069,7 @@
           <w:color w:val="4A4A49"/>
           <w:sz w:val="22"/>
         </w:rPr>
-        <w:t>[Slide 7] Por que esto no es Bases de Datos I, y el vocabulario minimo (1/2)</w:t>
+        <w:t>Convenciones de nombres para que el DDL corra a la primera (1/2)</w:t>
       </w:r>
       <w:r>
         <w:rPr>
@@ -565,7 +1090,7 @@
           <w:color w:val="4A4A49"/>
           <w:sz w:val="22"/>
         </w:rPr>
-        <w:t>Esta clase parece repetir Bases de Datos I y no lo hace.</w:t>
+        <w:t>Convenciones de nombres del curso.</w:t>
       </w:r>
     </w:p>
     <w:p>
@@ -578,7 +1103,7 @@
           <w:color w:val="4A4A49"/>
           <w:sz w:val="22"/>
         </w:rPr>
-        <w:t>Conviene fijar el vocabulario operativo antes de dibujar nada.</w:t>
+        <w:t>Identificadores sustitutos uniformes con el patron id_&lt;entidad&gt;, el mismo nombre en la tabla propia y en la que la referencia, para que el JOIN se escriba sin buscar como se llamo la columna alla.</w:t>
       </w:r>
     </w:p>
     <w:p>
@@ -591,7 +1116,7 @@
           <w:color w:val="4A4A49"/>
           <w:sz w:val="22"/>
         </w:rPr>
-        <w:t>Conviene desactivar una trampa de vocabulario: la palabra dominio se usara hoy con dos sentidos, el de un atributo y el del proyecto, que es la clinica Huellitas.</w:t>
+        <w:t>Fuera de la lamina (habla de la practica): Convenciones de nombres del curso, y hay que exigirlas desde hoy porque el taller se corrige ejecutando el guion en el PostgreSQL que PostgreSQL en el navegador trae en el navegador.</w:t>
       </w:r>
     </w:p>
     <w:p>
@@ -601,25 +1126,7 @@
           <w:color w:val="4A4A49"/>
           <w:sz w:val="22"/>
         </w:rPr>
-        <w:t>[Slide 8] Por que esto no es Bases de Datos I, y el vocabulario minimo (2/2)</w:t>
-      </w:r>
-      <w:r>
-        <w:rPr>
-          <w:b w:val="0"/>
-          <w:color w:val="4A4A49"/>
-          <w:sz w:val="22"/>
-        </w:rPr>
-        <w:t xml:space="preserve"> — 2 vinetas.</w:t>
-      </w:r>
-    </w:p>
-    <w:p>
-      <w:r>
-        <w:rPr>
-          <w:b/>
-          <w:color w:val="4A4A49"/>
-          <w:sz w:val="22"/>
-        </w:rPr>
-        <w:t>[Slide 9] Nivel conceptual y nivel fisico: dos vistas del mismo modelo</w:t>
+        <w:t>Convenciones de nombres para que el DDL corra a la primera (2/2)</w:t>
       </w:r>
       <w:r>
         <w:rPr>
@@ -631,16 +1138,21 @@
       </w:r>
     </w:p>
     <w:p>
-      <w:pPr>
-        <w:pStyle w:val="ListBullet2"/>
-      </w:pPr>
+      <w:r>
+        <w:rPr>
+          <w:b/>
+          <w:color w:val="4A4A49"/>
+          <w:sz w:val="22"/>
+        </w:rPr>
+        <w:t>Herramientas del dia y que se puede demostrar con cada una</w:t>
+      </w:r>
       <w:r>
         <w:rPr>
           <w:b w:val="0"/>
           <w:color w:val="4A4A49"/>
           <w:sz w:val="22"/>
         </w:rPr>
-        <w:t>Antes de cualquier otra cosa hay que separar dos niveles que el estudiante mezcla y que hoy se recorren los dos.</w:t>
+        <w:t xml:space="preserve"> — 3 vinetas.</w:t>
       </w:r>
     </w:p>
     <w:p>
@@ -653,7 +1165,72 @@
           <w:color w:val="4A4A49"/>
           <w:sz w:val="22"/>
         </w:rPr>
-        <w:t>Conviene decirlo en voz alta porque explica por que se exige tipo y longitud en el diagrama: no es decoracion, es lo que hace traducible el dibujo.</w:t>
+        <w:t>Sobre lo que se puede demostrar con herramientas gratuitas conviene ser preciso.</w:t>
+      </w:r>
+    </w:p>
+    <w:p>
+      <w:pPr>
+        <w:pStyle w:val="ListBullet2"/>
+      </w:pPr>
+      <w:r>
+        <w:rPr>
+          <w:b w:val="0"/>
+          <w:color w:val="4A4A49"/>
+          <w:sz w:val="22"/>
+        </w:rPr>
+        <w:t>En DB Fiddle, sin cuenta y en menos de un minuto, se ejecuta el guion completo de CREATE TABLE con claves primarias, foraneas y CHECK, se insertan Ana Perez, Luna y su cita, se corre el JOIN de las tres tablas y, sobre todo, se provoca el error de integridad en vivo insertando una cita con id_mascota inexistente para que el grupo lea el mensaje real del motor.</w:t>
+      </w:r>
+    </w:p>
+    <w:p>
+      <w:pPr>
+        <w:pStyle w:val="ListBullet2"/>
+      </w:pPr>
+      <w:r>
+        <w:rPr>
+          <w:b w:val="0"/>
+          <w:color w:val="4A4A49"/>
+          <w:sz w:val="22"/>
+        </w:rPr>
+        <w:t>Lo que DB Fiddle no da es persistencia: cada ejecucion recrea el esquema desde cero y no hay usuarios ni roles reales, razon por la cual la Clase 2 trabaja con matriz documentada.</w:t>
+      </w:r>
+    </w:p>
+    <w:p>
+      <w:pPr>
+        <w:pStyle w:val="ListBullet2"/>
+      </w:pPr>
+      <w:r>
+        <w:rPr>
+          <w:b w:val="0"/>
+          <w:color w:val="4A4A49"/>
+          <w:sz w:val="22"/>
+        </w:rPr>
+        <w:t>Oracle Live SQL exige cuenta gratuita pero conserva esquema y guiones entre sesiones y admite bloques PL/SQL, que es lo que se necesitara desde la Clase 3; conviene que el estudiante la cree hoy y no el dia que la necesite. draw.io corre en el navegador, no pide cuenta y exporta PNG, el formato que pide PostgreSQL en el navegador.</w:t>
+      </w:r>
+    </w:p>
+    <w:p>
+      <w:pPr>
+        <w:pStyle w:val="ListBullet2"/>
+      </w:pPr>
+      <w:r>
+        <w:rPr>
+          <w:b w:val="0"/>
+          <w:color w:val="4A4A49"/>
+          <w:sz w:val="22"/>
+        </w:rPr>
+        <w:t>De ahi sale la regla operativa del curso: la fuente de verdad es el archivo sql en la carpeta del proyecto, nunca la pestana del navegador, y el estudiante va bien si reconstruye el esquema completo en menos de cinco minutos pegando su propio guion. draw.io y Excalidraw: son pizarras para pensar el modelo a mano alzada, sin instalar nada.</w:t>
+      </w:r>
+    </w:p>
+    <w:p>
+      <w:pPr>
+        <w:pStyle w:val="ListBullet2"/>
+      </w:pPr>
+      <w:r>
+        <w:rPr>
+          <w:b w:val="0"/>
+          <w:color w:val="4A4A49"/>
+          <w:sz w:val="22"/>
+        </w:rPr>
+        <w:t>Fuera de la lamina (habla de la practica): Sobre lo que se puede demostrar con herramientas gratuitas conviene ser preciso, porque de eso depende que el taller no se atore.</w:t>
       </w:r>
     </w:p>
     <w:p>
@@ -663,7 +1240,7 @@
           <w:color w:val="4A4A49"/>
           <w:sz w:val="22"/>
         </w:rPr>
-        <w:t>[Slide 10] Clave primaria: natural o sustituta</w:t>
+        <w:t>Del ER dibujado al codigo Mermaid</w:t>
       </w:r>
       <w:r>
         <w:rPr>
@@ -671,7 +1248,7 @@
           <w:color w:val="4A4A49"/>
           <w:sz w:val="22"/>
         </w:rPr>
-        <w:t xml:space="preserve"> — 6 vinetas.</w:t>
+        <w:t xml:space="preserve"> — 3 vinetas.</w:t>
       </w:r>
     </w:p>
     <w:p>
@@ -684,7 +1261,7 @@
           <w:color w:val="4A4A49"/>
           <w:sz w:val="22"/>
         </w:rPr>
-        <w:t>Eso no es estilo, es una restriccion que el motor verifica en cada INSERT y UPDATE y que rechaza con error.</w:t>
+        <w:t>Ultimo tramo.</w:t>
       </w:r>
     </w:p>
     <w:p>
@@ -697,7 +1274,7 @@
           <w:color w:val="4A4A49"/>
           <w:sz w:val="22"/>
         </w:rPr>
-        <w:t>La natural ahorra un JOIN cuando se busca por ella; la sustituta gana cuando el dato natural cambia, se repite o todavia no existe.</w:t>
+        <w:t>Eso no significa que haya que dibujar escribiendo codigo, y conviene decirlo asi para que nadie se bloquee: el camino corto es disenar visual en draw.io o Excalidraw, que es donde se piensa el modelo, y despues pedirle a una IA que traduzca ese boceto a Mermaid.</w:t>
       </w:r>
     </w:p>
     <w:p>
@@ -710,7 +1287,7 @@
           <w:color w:val="4A4A49"/>
           <w:sz w:val="22"/>
         </w:rPr>
-        <w:t>Por eso el esquema usa identificadores sustitutos y guarda el dato natural aparte con unicidad:.</w:t>
+        <w:t>El PNG exportado se conserva en la carpeta del proyecto para el informe, pero no reemplaza la respuesta en la plataforma.</w:t>
       </w:r>
     </w:p>
     <w:p>
@@ -723,7 +1300,20 @@
           <w:color w:val="4A4A49"/>
           <w:sz w:val="22"/>
         </w:rPr>
-        <w:t>UNIQUE impide dos duenos con la misma cedula, permite dejarla nula un rato y permite corregirla sin tocar las filas de mascota que apuntan al dueno.</w:t>
+        <w:t>La demo debe terminar exactamente ahi, y deja los cuatro pasos proyectados mientras el grupo trabaja.</w:t>
+      </w:r>
+    </w:p>
+    <w:p>
+      <w:pPr>
+        <w:pStyle w:val="ListBullet2"/>
+      </w:pPr>
+      <w:r>
+        <w:rPr>
+          <w:b w:val="0"/>
+          <w:color w:val="4A4A49"/>
+          <w:sz w:val="22"/>
+        </w:rPr>
+        <w:t>Fuera de la lamina (habla de la practica): Ultimo tramo, y es el que decide si el taller se entrega o no: como pasa el estudiante del dibujo a lo que la plataforma califica.</w:t>
       </w:r>
     </w:p>
     <w:p>
@@ -733,100 +1323,7 @@
           <w:color w:val="4A4A49"/>
           <w:sz w:val="22"/>
         </w:rPr>
-        <w:t>[Slide 11] Clave primaria: natural o sustituta — sintaxis</w:t>
-      </w:r>
-      <w:r>
-        <w:rPr>
-          <w:b w:val="0"/>
-          <w:color w:val="4A4A49"/>
-          <w:sz w:val="22"/>
-        </w:rPr>
-        <w:t xml:space="preserve"> — 7 vinetas.</w:t>
-      </w:r>
-    </w:p>
-    <w:p>
-      <w:r>
-        <w:rPr>
-          <w:b/>
-          <w:color w:val="4A4A49"/>
-          <w:sz w:val="22"/>
-        </w:rPr>
-        <w:t>[Slide 12] Normalizacion 1FN-3FN: primero la enfermedad (1/2)</w:t>
-      </w:r>
-      <w:r>
-        <w:rPr>
-          <w:b w:val="0"/>
-          <w:color w:val="4A4A49"/>
-          <w:sz w:val="22"/>
-        </w:rPr>
-        <w:t xml:space="preserve"> — 6 vinetas.</w:t>
-      </w:r>
-    </w:p>
-    <w:p>
-      <w:pPr>
-        <w:pStyle w:val="ListBullet2"/>
-      </w:pPr>
-      <w:r>
-        <w:rPr>
-          <w:b w:val="0"/>
-          <w:color w:val="4A4A49"/>
-          <w:sz w:val="22"/>
-        </w:rPr>
-        <w:t>Supongamos que el estudiante guarda el telefono del dueno dentro de cada fila de cita.</w:t>
-      </w:r>
-    </w:p>
-    <w:p>
-      <w:pPr>
-        <w:pStyle w:val="ListBullet2"/>
-      </w:pPr>
-      <w:r>
-        <w:rPr>
-          <w:b w:val="0"/>
-          <w:color w:val="4A4A49"/>
-          <w:sz w:val="22"/>
-        </w:rPr>
-        <w:t>Aparecen tres anomalias.</w:t>
-      </w:r>
-    </w:p>
-    <w:p>
-      <w:pPr>
-        <w:pStyle w:val="ListBullet2"/>
-      </w:pPr>
-      <w:r>
-        <w:rPr>
-          <w:b w:val="0"/>
-          <w:color w:val="4A4A49"/>
-          <w:sz w:val="22"/>
-        </w:rPr>
-        <w:t>Leidas asi, las tres formas normales son tres vacunas.</w:t>
-      </w:r>
-    </w:p>
-    <w:p>
-      <w:r>
-        <w:rPr>
-          <w:b/>
-          <w:color w:val="4A4A49"/>
-          <w:sz w:val="22"/>
-        </w:rPr>
-        <w:t>[Slide 13] Normalizacion 1FN-3FN: primero la enfermedad (2/2)</w:t>
-      </w:r>
-      <w:r>
-        <w:rPr>
-          <w:b w:val="0"/>
-          <w:color w:val="4A4A49"/>
-          <w:sz w:val="22"/>
-        </w:rPr>
-        <w:t xml:space="preserve"> — 4 vinetas.</w:t>
-      </w:r>
-    </w:p>
-    <w:p>
-      <w:r>
-        <w:rPr>
-          <w:b/>
-          <w:color w:val="4A4A49"/>
-          <w:sz w:val="22"/>
-        </w:rPr>
-        <w:t>[Slide 14] Clave foranea, borrado y por que la FK no basta (1/2)</w:t>
+        <w:t>Preguntas frecuentes del grupo</w:t>
       </w:r>
       <w:r>
         <w:rPr>
@@ -847,534 +1344,6 @@
           <w:color w:val="4A4A49"/>
           <w:sz w:val="22"/>
         </w:rPr>
-        <w:t>Lo que casi nunca se explica es la otra mitad: que pasa al borrar el padre.</w:t>
-      </w:r>
-    </w:p>
-    <w:p>
-      <w:pPr>
-        <w:pStyle w:val="ListBullet2"/>
-      </w:pPr>
-      <w:r>
-        <w:rPr>
-          <w:b w:val="0"/>
-          <w:color w:val="4A4A49"/>
-          <w:sz w:val="22"/>
-        </w:rPr>
-        <w:t>Al declarar la clave foranea se elige el comportamiento</w:t>
-      </w:r>
-    </w:p>
-    <w:p>
-      <w:pPr>
-        <w:pStyle w:val="ListBullet2"/>
-      </w:pPr>
-      <w:r>
-        <w:rPr>
-          <w:b w:val="0"/>
-          <w:color w:val="4A4A49"/>
-          <w:sz w:val="22"/>
-        </w:rPr>
-        <w:t>RESTRICT o NO ACTION impide borrar el dueno mientras tenga mascotas, CASCADE borra las filas hijas en cadena y SET NULL deja la referencia nula.</w:t>
-      </w:r>
-    </w:p>
-    <w:p>
-      <w:pPr>
-        <w:pStyle w:val="ListBullet2"/>
-      </w:pPr>
-      <w:r>
-        <w:rPr>
-          <w:b w:val="0"/>
-          <w:color w:val="4A4A49"/>
-          <w:sz w:val="22"/>
-        </w:rPr>
-        <w:t>Esa baja logica es la que obliga a validar en la Clase 3 que una mascota inactiva no agende, porque la clave foranea la sigue aceptando: el identificador existe, el negocio no lo quiere.</w:t>
-      </w:r>
-    </w:p>
-    <w:p>
-      <w:pPr>
-        <w:pStyle w:val="ListBullet2"/>
-      </w:pPr>
-      <w:r>
-        <w:rPr>
-          <w:b w:val="0"/>
-          <w:color w:val="4A4A49"/>
-          <w:sz w:val="22"/>
-        </w:rPr>
-        <w:t>ON DELETE SET NULL deja la fila huerfana con la columna en nulo.</w:t>
-      </w:r>
-    </w:p>
-    <w:p>
-      <w:r>
-        <w:rPr>
-          <w:b/>
-          <w:color w:val="4A4A49"/>
-          <w:sz w:val="22"/>
-        </w:rPr>
-        <w:t>[Slide 15] Clave foranea, borrado y por que la FK no basta (2/2)</w:t>
-      </w:r>
-      <w:r>
-        <w:rPr>
-          <w:b w:val="0"/>
-          <w:color w:val="4A4A49"/>
-          <w:sz w:val="22"/>
-        </w:rPr>
-        <w:t xml:space="preserve"> — 4 vinetas.</w:t>
-      </w:r>
-    </w:p>
-    <w:p>
-      <w:r>
-        <w:rPr>
-          <w:b/>
-          <w:color w:val="4A4A49"/>
-          <w:sz w:val="22"/>
-        </w:rPr>
-        <w:t>[Slide 16] Clave foranea, borrado y por que la FK no... — sintaxis</w:t>
-      </w:r>
-      <w:r>
-        <w:rPr>
-          <w:b w:val="0"/>
-          <w:color w:val="4A4A49"/>
-          <w:sz w:val="22"/>
-        </w:rPr>
-        <w:t xml:space="preserve"> — 2 vinetas.</w:t>
-      </w:r>
-    </w:p>
-    <w:p>
-      <w:r>
-        <w:rPr>
-          <w:b/>
-          <w:color w:val="4A4A49"/>
-          <w:sz w:val="22"/>
-        </w:rPr>
-        <w:t>[Slide 17] Baja logica: activa CHAR(1) en vez de DELETE</w:t>
-      </w:r>
-      <w:r>
-        <w:rPr>
-          <w:b w:val="0"/>
-          <w:color w:val="4A4A49"/>
-          <w:sz w:val="22"/>
-        </w:rPr>
-        <w:t xml:space="preserve"> — 4 vinetas.</w:t>
-      </w:r>
-    </w:p>
-    <w:p>
-      <w:pPr>
-        <w:pStyle w:val="ListBullet2"/>
-      </w:pPr>
-      <w:r>
-        <w:rPr>
-          <w:b w:val="0"/>
-          <w:color w:val="4A4A49"/>
-          <w:sz w:val="22"/>
-        </w:rPr>
-        <w:t>Conviene detenerse en la baja logica porque es la decision que sostiene medio semestre y casi nunca se explica.</w:t>
-      </w:r>
-    </w:p>
-    <w:p>
-      <w:pPr>
-        <w:pStyle w:val="ListBullet2"/>
-      </w:pPr>
-      <w:r>
-        <w:rPr>
-          <w:b w:val="0"/>
-          <w:color w:val="4A4A49"/>
-          <w:sz w:val="22"/>
-        </w:rPr>
-        <w:t>Lo que se hace es marcar la fila como inactiva: activa CHAR(1) DEFAULT 'S' CHECK (activa IN ('S','N')), y las consultas del dia a dia filtran WHERE activa = 'S'.</w:t>
-      </w:r>
-    </w:p>
-    <w:p>
-      <w:pPr>
-        <w:pStyle w:val="ListBullet2"/>
-      </w:pPr>
-      <w:r>
-        <w:rPr>
-          <w:b w:val="0"/>
-          <w:color w:val="4A4A49"/>
-          <w:sz w:val="22"/>
-        </w:rPr>
-        <w:t>La consecuencia que hay que subrayar, porque es la que abre la Clase 3, es que la clave foranea NO defiende esa regla: para el motor, la mascota inactiva existe y su identificador es valido, asi que aceptara sin chistar una cita nueva sobre ella.</w:t>
-      </w:r>
-    </w:p>
-    <w:p>
-      <w:pPr>
-        <w:pStyle w:val="ListBullet2"/>
-      </w:pPr>
-      <w:r>
-        <w:rPr>
-          <w:b w:val="0"/>
-          <w:color w:val="4A4A49"/>
-          <w:sz w:val="22"/>
-        </w:rPr>
-        <w:t>Si el estudiante sale hoy con DELETE en la cabeza, en la Clase 3 no va a entender por que hace falta sp_agendar_cita.</w:t>
-      </w:r>
-    </w:p>
-    <w:p>
-      <w:r>
-        <w:rPr>
-          <w:b/>
-          <w:color w:val="4A4A49"/>
-          <w:sz w:val="22"/>
-        </w:rPr>
-        <w:t>[Slide 18] Que separa un diagrama ER de un dibujo (1/2)</w:t>
-      </w:r>
-      <w:r>
-        <w:rPr>
-          <w:b w:val="0"/>
-          <w:color w:val="4A4A49"/>
-          <w:sz w:val="22"/>
-        </w:rPr>
-        <w:t xml:space="preserve"> — 5 vinetas.</w:t>
-      </w:r>
-    </w:p>
-    <w:p>
-      <w:pPr>
-        <w:pStyle w:val="ListBullet2"/>
-      </w:pPr>
-      <w:r>
-        <w:rPr>
-          <w:b w:val="0"/>
-          <w:color w:val="4A4A49"/>
-          <w:sz w:val="22"/>
-        </w:rPr>
-        <w:t>Eso se materializa como consulta.id_cita NOT NULL UNIQUE, no como una clave foranea simple, y decidirlo hoy evita la pregunta que aparece en la Clase 3 cuando alguien intenta registrar la consulta antes de la cita.</w:t>
-      </w:r>
-    </w:p>
-    <w:p>
-      <w:r>
-        <w:rPr>
-          <w:b/>
-          <w:color w:val="4A4A49"/>
-          <w:sz w:val="22"/>
-        </w:rPr>
-        <w:t>[Slide 19] Que separa un diagrama ER de un dibujo (2/2)</w:t>
-      </w:r>
-      <w:r>
-        <w:rPr>
-          <w:b w:val="0"/>
-          <w:color w:val="4A4A49"/>
-          <w:sz w:val="22"/>
-        </w:rPr>
-        <w:t xml:space="preserve"> — 3 vinetas.</w:t>
-      </w:r>
-    </w:p>
-    <w:p>
-      <w:r>
-        <w:rPr>
-          <w:b/>
-          <w:color w:val="4A4A49"/>
-          <w:sz w:val="22"/>
-        </w:rPr>
-        <w:t>[Slide 20] Tipos de datos: donde se pagan las facturas mas caras (1/2)</w:t>
-      </w:r>
-      <w:r>
-        <w:rPr>
-          <w:b w:val="0"/>
-          <w:color w:val="4A4A49"/>
-          <w:sz w:val="22"/>
-        </w:rPr>
-        <w:t xml:space="preserve"> — 4 vinetas.</w:t>
-      </w:r>
-    </w:p>
-    <w:p>
-      <w:r>
-        <w:rPr>
-          <w:b/>
-          <w:color w:val="4A4A49"/>
-          <w:sz w:val="22"/>
-        </w:rPr>
-        <w:t>[Slide 21] Tipos de datos: donde se pagan las facturas mas caras (2/2)</w:t>
-      </w:r>
-      <w:r>
-        <w:rPr>
-          <w:b w:val="0"/>
-          <w:color w:val="4A4A49"/>
-          <w:sz w:val="22"/>
-        </w:rPr>
-        <w:t xml:space="preserve"> — 3 vinetas.</w:t>
-      </w:r>
-    </w:p>
-    <w:p>
-      <w:r>
-        <w:rPr>
-          <w:b/>
-          <w:color w:val="4A4A49"/>
-          <w:sz w:val="22"/>
-        </w:rPr>
-        <w:t>[Slide 22] Convenciones de nombres para que el DDL corra a la primera (1/2)</w:t>
-      </w:r>
-      <w:r>
-        <w:rPr>
-          <w:b w:val="0"/>
-          <w:color w:val="4A4A49"/>
-          <w:sz w:val="22"/>
-        </w:rPr>
-        <w:t xml:space="preserve"> — 4 vinetas.</w:t>
-      </w:r>
-    </w:p>
-    <w:p>
-      <w:pPr>
-        <w:pStyle w:val="ListBullet2"/>
-      </w:pPr>
-      <w:r>
-        <w:rPr>
-          <w:b w:val="0"/>
-          <w:color w:val="4A4A49"/>
-          <w:sz w:val="22"/>
-        </w:rPr>
-        <w:t>Convenciones de nombres del curso.</w:t>
-      </w:r>
-    </w:p>
-    <w:p>
-      <w:pPr>
-        <w:pStyle w:val="ListBullet2"/>
-      </w:pPr>
-      <w:r>
-        <w:rPr>
-          <w:b w:val="0"/>
-          <w:color w:val="4A4A49"/>
-          <w:sz w:val="22"/>
-        </w:rPr>
-        <w:t>Identificadores sustitutos uniformes con el patron id_&lt;entidad&gt;, el mismo nombre en la tabla propia y en la que la referencia, para que el JOIN se escriba sin buscar como se llamo la columna alla.</w:t>
-      </w:r>
-    </w:p>
-    <w:p>
-      <w:pPr>
-        <w:pStyle w:val="ListBullet2"/>
-      </w:pPr>
-      <w:r>
-        <w:rPr>
-          <w:b w:val="0"/>
-          <w:color w:val="4A4A49"/>
-          <w:sz w:val="22"/>
-        </w:rPr>
-        <w:t>Fuera de la lamina (habla de la practica): Convenciones de nombres del curso, y hay que exigirlas desde hoy porque el taller se corrige ejecutando el guion en el PostgreSQL que PostgreSQL en el navegador trae en el navegador.</w:t>
-      </w:r>
-    </w:p>
-    <w:p>
-      <w:r>
-        <w:rPr>
-          <w:b/>
-          <w:color w:val="4A4A49"/>
-          <w:sz w:val="22"/>
-        </w:rPr>
-        <w:t>[Slide 23] Convenciones de nombres para que el DDL corra a la primera (2/2)</w:t>
-      </w:r>
-      <w:r>
-        <w:rPr>
-          <w:b w:val="0"/>
-          <w:color w:val="4A4A49"/>
-          <w:sz w:val="22"/>
-        </w:rPr>
-        <w:t xml:space="preserve"> — 4 vinetas.</w:t>
-      </w:r>
-    </w:p>
-    <w:p>
-      <w:r>
-        <w:rPr>
-          <w:b/>
-          <w:color w:val="4A4A49"/>
-          <w:sz w:val="22"/>
-        </w:rPr>
-        <w:t>[Slide 24] Herramientas del dia y que se puede demostrar con cada una</w:t>
-      </w:r>
-      <w:r>
-        <w:rPr>
-          <w:b w:val="0"/>
-          <w:color w:val="4A4A49"/>
-          <w:sz w:val="22"/>
-        </w:rPr>
-        <w:t xml:space="preserve"> — 3 vinetas.</w:t>
-      </w:r>
-    </w:p>
-    <w:p>
-      <w:pPr>
-        <w:pStyle w:val="ListBullet2"/>
-      </w:pPr>
-      <w:r>
-        <w:rPr>
-          <w:b w:val="0"/>
-          <w:color w:val="4A4A49"/>
-          <w:sz w:val="22"/>
-        </w:rPr>
-        <w:t>Sobre lo que se puede demostrar con herramientas gratuitas conviene ser preciso.</w:t>
-      </w:r>
-    </w:p>
-    <w:p>
-      <w:pPr>
-        <w:pStyle w:val="ListBullet2"/>
-      </w:pPr>
-      <w:r>
-        <w:rPr>
-          <w:b w:val="0"/>
-          <w:color w:val="4A4A49"/>
-          <w:sz w:val="22"/>
-        </w:rPr>
-        <w:t>En DB Fiddle, sin cuenta y en menos de un minuto, se ejecuta el guion completo de CREATE TABLE con claves primarias, foraneas y CHECK, se insertan Ana Perez, Luna y su cita, se corre el JOIN de las tres tablas y, sobre todo, se provoca el error de integridad en vivo insertando una cita con id_mascota inexistente para que el grupo lea el mensaje real del motor.</w:t>
-      </w:r>
-    </w:p>
-    <w:p>
-      <w:pPr>
-        <w:pStyle w:val="ListBullet2"/>
-      </w:pPr>
-      <w:r>
-        <w:rPr>
-          <w:b w:val="0"/>
-          <w:color w:val="4A4A49"/>
-          <w:sz w:val="22"/>
-        </w:rPr>
-        <w:t>Lo que DB Fiddle no da es persistencia: cada ejecucion recrea el esquema desde cero y no hay usuarios ni roles reales, razon por la cual la Clase 2 trabaja con matriz documentada.</w:t>
-      </w:r>
-    </w:p>
-    <w:p>
-      <w:pPr>
-        <w:pStyle w:val="ListBullet2"/>
-      </w:pPr>
-      <w:r>
-        <w:rPr>
-          <w:b w:val="0"/>
-          <w:color w:val="4A4A49"/>
-          <w:sz w:val="22"/>
-        </w:rPr>
-        <w:t>Oracle Live SQL exige cuenta gratuita pero conserva esquema y guiones entre sesiones y admite bloques PL/SQL, que es lo que se necesitara desde la Clase 3; conviene que el estudiante la cree hoy y no el dia que la necesite. draw.io corre en el navegador, no pide cuenta y exporta PNG, el formato que pide PostgreSQL en el navegador.</w:t>
-      </w:r>
-    </w:p>
-    <w:p>
-      <w:pPr>
-        <w:pStyle w:val="ListBullet2"/>
-      </w:pPr>
-      <w:r>
-        <w:rPr>
-          <w:b w:val="0"/>
-          <w:color w:val="4A4A49"/>
-          <w:sz w:val="22"/>
-        </w:rPr>
-        <w:t>De ahi sale la regla operativa del curso: la fuente de verdad es el archivo sql en la carpeta del proyecto, nunca la pestana del navegador, y el estudiante va bien si reconstruye el esquema completo en menos de cinco minutos pegando su propio guion. draw.io y Excalidraw: son pizarras para pensar el modelo a mano alzada, sin instalar nada.</w:t>
-      </w:r>
-    </w:p>
-    <w:p>
-      <w:pPr>
-        <w:pStyle w:val="ListBullet2"/>
-      </w:pPr>
-      <w:r>
-        <w:rPr>
-          <w:b w:val="0"/>
-          <w:color w:val="4A4A49"/>
-          <w:sz w:val="22"/>
-        </w:rPr>
-        <w:t>Fuera de la lamina (habla de la practica): Sobre lo que se puede demostrar con herramientas gratuitas conviene ser preciso, porque de eso depende que el taller no se atore.</w:t>
-      </w:r>
-    </w:p>
-    <w:p>
-      <w:r>
-        <w:rPr>
-          <w:b/>
-          <w:color w:val="4A4A49"/>
-          <w:sz w:val="22"/>
-        </w:rPr>
-        <w:t>[Slide 25] Del ER dibujado al codigo Mermaid</w:t>
-      </w:r>
-      <w:r>
-        <w:rPr>
-          <w:b w:val="0"/>
-          <w:color w:val="4A4A49"/>
-          <w:sz w:val="22"/>
-        </w:rPr>
-        <w:t xml:space="preserve"> — 3 vinetas.</w:t>
-      </w:r>
-    </w:p>
-    <w:p>
-      <w:pPr>
-        <w:pStyle w:val="ListBullet2"/>
-      </w:pPr>
-      <w:r>
-        <w:rPr>
-          <w:b w:val="0"/>
-          <w:color w:val="4A4A49"/>
-          <w:sz w:val="22"/>
-        </w:rPr>
-        <w:t>Ultimo tramo.</w:t>
-      </w:r>
-    </w:p>
-    <w:p>
-      <w:pPr>
-        <w:pStyle w:val="ListBullet2"/>
-      </w:pPr>
-      <w:r>
-        <w:rPr>
-          <w:b w:val="0"/>
-          <w:color w:val="4A4A49"/>
-          <w:sz w:val="22"/>
-        </w:rPr>
-        <w:t>Eso no significa que haya que dibujar escribiendo codigo, y conviene decirlo asi para que nadie se bloquee: el camino corto es disenar visual en draw.io o Excalidraw, que es donde se piensa el modelo, y despues pedirle a una IA que traduzca ese boceto a Mermaid.</w:t>
-      </w:r>
-    </w:p>
-    <w:p>
-      <w:pPr>
-        <w:pStyle w:val="ListBullet2"/>
-      </w:pPr>
-      <w:r>
-        <w:rPr>
-          <w:b w:val="0"/>
-          <w:color w:val="4A4A49"/>
-          <w:sz w:val="22"/>
-        </w:rPr>
-        <w:t>El PNG exportado se conserva en la carpeta del PI para el informe, pero no reemplaza la respuesta en la plataforma.</w:t>
-      </w:r>
-    </w:p>
-    <w:p>
-      <w:pPr>
-        <w:pStyle w:val="ListBullet2"/>
-      </w:pPr>
-      <w:r>
-        <w:rPr>
-          <w:b w:val="0"/>
-          <w:color w:val="4A4A49"/>
-          <w:sz w:val="22"/>
-        </w:rPr>
-        <w:t>La demo debe terminar exactamente ahi, y deja los cuatro pasos proyectados mientras el grupo trabaja.</w:t>
-      </w:r>
-    </w:p>
-    <w:p>
-      <w:pPr>
-        <w:pStyle w:val="ListBullet2"/>
-      </w:pPr>
-      <w:r>
-        <w:rPr>
-          <w:b w:val="0"/>
-          <w:color w:val="4A4A49"/>
-          <w:sz w:val="22"/>
-        </w:rPr>
-        <w:t>Fuera de la lamina (habla de la practica): Ultimo tramo, y es el que decide si el taller se entrega o no: como pasa el estudiante del dibujo a lo que la plataforma califica.</w:t>
-      </w:r>
-    </w:p>
-    <w:p>
-      <w:r>
-        <w:rPr>
-          <w:b/>
-          <w:color w:val="4A4A49"/>
-          <w:sz w:val="22"/>
-        </w:rPr>
-        <w:t>[Slide 26] Preguntas frecuentes del grupo</w:t>
-      </w:r>
-      <w:r>
-        <w:rPr>
-          <w:b w:val="0"/>
-          <w:color w:val="4A4A49"/>
-          <w:sz w:val="22"/>
-        </w:rPr>
-        <w:t xml:space="preserve"> — 5 vinetas.</w:t>
-      </w:r>
-    </w:p>
-    <w:p>
-      <w:pPr>
-        <w:pStyle w:val="ListBullet2"/>
-      </w:pPr>
-      <w:r>
-        <w:rPr>
-          <w:b w:val="0"/>
-          <w:color w:val="4A4A49"/>
-          <w:sz w:val="22"/>
-        </w:rPr>
         <w:t>Tres preguntas aparecen casi siempre y conviene tener la respuesta lista.</w:t>
       </w:r>
     </w:p>
@@ -1411,7 +1380,7 @@
           <w:color w:val="4A4A49"/>
           <w:sz w:val="22"/>
         </w:rPr>
-        <w:t>[Slide 27] El patron de tabla: PK, obligatorios y dominio cerrado</w:t>
+        <w:t>El patron de tabla: PK, obligatorios y dominio cerrado</w:t>
       </w:r>
       <w:r>
         <w:rPr>
@@ -1429,7 +1398,7 @@
           <w:color w:val="4A4A49"/>
           <w:sz w:val="22"/>
         </w:rPr>
-        <w:t>[Slide 28] La clave foranea y que pasa al borrar el padre</w:t>
+        <w:t>La clave foranea y que pasa al borrar el padre</w:t>
       </w:r>
       <w:r>
         <w:rPr>
@@ -1447,7 +1416,7 @@
           <w:color w:val="4A4A49"/>
           <w:sz w:val="22"/>
         </w:rPr>
-        <w:t>[Slide 29] Integridad referencial: el error que devuelve el motor</w:t>
+        <w:t>Integridad referencial: el error que devuelve el motor</w:t>
       </w:r>
       <w:r>
         <w:rPr>
@@ -1465,7 +1434,7 @@
           <w:color w:val="4A4A49"/>
           <w:sz w:val="22"/>
         </w:rPr>
-        <w:t>[Slide 30] El JOIN de tres tablas</w:t>
+        <w:t>El JOIN de tres tablas</w:t>
       </w:r>
       <w:r>
         <w:rPr>
@@ -1483,7 +1452,7 @@
           <w:color w:val="4A4A49"/>
           <w:sz w:val="22"/>
         </w:rPr>
-        <w:t>[Slide 31] Lo que el DDL NO puede defender solo</w:t>
+        <w:t>Lo que el DDL NO puede defender solo</w:t>
       </w:r>
       <w:r>
         <w:rPr>
@@ -1572,7 +1541,7 @@
           <w:color w:val="4A4A49"/>
           <w:sz w:val="22"/>
         </w:rPr>
-        <w:t>Portada · Clase 1 · Revision BD I · Arranque VetCare DB</w:t>
+        <w:t>Portada · Clase 1 · Revision BD I · Arranque la base de la clínica</w:t>
       </w:r>
     </w:p>
     <w:p>
@@ -1611,7 +1580,7 @@
           <w:color w:val="4A4A49"/>
           <w:sz w:val="22"/>
         </w:rPr>
-        <w:t>El cliente · Clínica Veterinaria «Huellitas»</w:t>
+        <w:t>El cliente · la clínica Veterinaria</w:t>
       </w:r>
     </w:p>
     <w:p>
@@ -1624,20 +1593,7 @@
           <w:color w:val="4A4A49"/>
           <w:sz w:val="22"/>
         </w:rPr>
-        <w:t>El cliente: la clinica Huellitas (1/2)</w:t>
-      </w:r>
-    </w:p>
-    <w:p>
-      <w:pPr>
-        <w:pStyle w:val="ListNumber"/>
-      </w:pPr>
-      <w:r>
-        <w:rPr>
-          <w:b w:val="0"/>
-          <w:color w:val="4A4A49"/>
-          <w:sz w:val="22"/>
-        </w:rPr>
-        <w:t>El cliente: la clinica Huellitas (2/2)</w:t>
+        <w:t>El cliente: la clínica</w:t>
       </w:r>
     </w:p>
     <w:p>
@@ -1975,7 +1931,7 @@
           <w:color w:val="4A4A49"/>
           <w:sz w:val="22"/>
         </w:rPr>
-        <w:t>ER minimo VetCare (con cardinalidad)</w:t>
+        <w:t>ER minimo la clínica (con cardinalidad)</w:t>
       </w:r>
     </w:p>
     <w:p>
@@ -2324,7 +2280,7 @@
           <w:color w:val="1A1C1D"/>
           <w:sz w:val="32"/>
         </w:rPr>
-        <w:t>35-55 · Demo paso a paso · [Slide 34][Slide 35]</w:t>
+        <w:t>35-55 · Demo paso a paso · [Slide 33][Slide 34]</w:t>
       </w:r>
     </w:p>
     <w:p>
@@ -2380,7 +2336,7 @@
           <w:color w:val="4A4A49"/>
           <w:sz w:val="22"/>
         </w:rPr>
-        <w:t xml:space="preserve"> [Slide 35] — es la parte que el estudiante no adivina: pase el boceto a codigo Mermaid con ayuda de una IA, peguelo en la pregunta de diagrama y muestrelo renderizado.</w:t>
+        <w:t xml:space="preserve"> [Slide 34] — es la parte que el estudiante no adivina: pase el boceto a codigo Mermaid con ayuda de una IA, peguelo en la pregunta de diagrama y muestrelo renderizado.</w:t>
       </w:r>
     </w:p>
     <w:p>
@@ -2901,7 +2857,7 @@
           <w:color w:val="1A1C1D"/>
           <w:sz w:val="32"/>
         </w:rPr>
-        <w:t>115-120 · Cierre · [Slide 36]</w:t>
+        <w:t>115-120 · Cierre · [Slide 35]</w:t>
       </w:r>
     </w:p>
     <w:p>
@@ -2929,7 +2885,7 @@
           <w:color w:val="4A4A49"/>
           <w:sz w:val="22"/>
         </w:rPr>
-        <w:t>Proyectar [Slide 36] slide de cierre. Dudas finales.</w:t>
+        <w:t>Proyectar [Slide 35] slide de cierre. Dudas finales.</w:t>
       </w:r>
     </w:p>
     <w:p>

</xml_diff>